<commit_message>
Update docs v1.3 and secure .gitignore
- Dokumentasi_AgriTwin_v1.3.docx: fix endpoint count (14), add .gitattributes to dir tree, Fase 6 SELESAI
- .gitignore: exclude .claude/ session data and AGENTS_RUFLO.md
</commit_message>
<xml_diff>
--- a/docs/Dokumentasi_AgriTwin_v1.3.docx
+++ b/docs/Dokumentasi_AgriTwin_v1.3.docx
@@ -1743,7 +1743,7 @@
                 <w:rFonts w:ascii="Calibri" w:hAnsi="Calibri"/>
                 <w:sz w:val="20"/>
               </w:rPr>
-              <w:t>9 REST endpoint + 1 WebSocket realtime</w:t>
+              <w:t>14 REST endpoint + 1 WebSocket realtime</w:t>
             </w:r>
           </w:p>
         </w:tc>
@@ -3506,7 +3506,11 @@
         <w:br/>
         <w:t>├── .env.example               # Template environment variables</w:t>
         <w:br/>
-        <w:t>├── agri_config.json           # Konfigurasi non-secret fallback</w:t>
+        <w:t>├── .gitignore                 # Kecualikan .env, *.db, *.pkl, node_modules</w:t>
+        <w:br/>
+        <w:t>├── .gitattributes             # Normalisasi line ending (LF) untuk cross-platform</w:t>
+        <w:br/>
+        <w:t>├── agri_config.json           # Konfigurasi non-secret fallback (git-ignored)</w:t>
         <w:br/>
         <w:t>├── requirements.txt           # Dependensi untuk tumbal.py</w:t>
         <w:br/>
@@ -8864,7 +8868,7 @@
                 <w:rFonts w:ascii="Calibri" w:hAnsi="Calibri"/>
                 <w:sz w:val="20"/>
               </w:rPr>
-              <w:t>IN PROGRESS 🔄</w:t>
+              <w:t>SELESAI ✓</w:t>
             </w:r>
           </w:p>
         </w:tc>

</xml_diff>

<commit_message>
Use live USD/IDR rate for World Bank commodity price conversion
_fetch_world_bank() converted USD/ton to IDR/kg using a hardcoded
1 USD = Rp16,000 constant, which drifts from the real rate over time
(currently off by ~12%). Added _fetch_usd_idr_rate(), pulling live from
frankfurter.app (free, no API key, ECB-sourced), cached 6h alongside
commodity prices, with graceful fallback to the last successful rate
(or the Rp16,000 constant if none has ever succeeded).
</commit_message>
<xml_diff>
--- a/docs/Dokumentasi_AgriTwin_v1.3.docx
+++ b/docs/Dokumentasi_AgriTwin_v1.3.docx
@@ -4542,6 +4542,14 @@
           <w:sz w:val="22"/>
         </w:rPr>
         <w:t>Mapping alias bahasa Inggris → nama Indonesia (tomato → tomat, dst.)</w:t>
+      </w:r>
+    </w:p>
+    <w:p>
+      <w:pPr>
+        <w:pStyle w:val="ListBullet"/>
+      </w:pPr>
+      <w:r>
+        <w:t>Konversi harga World Bank (USD/ton -&gt; IDR/kg) sekarang pakai kurs USD/IDR live dari frankfurter.app (data resmi European Central Bank, gratis, tanpa API key), bukan kurs hardcode 1 USD = Rp16.000. Di-cache 6 jam sama seperti harga komoditas; kalau fetch gagal, pakai rate terakhir yang berhasil, baru fallback ke Rp16.000 kalau belum pernah berhasil sama sekali.</w:t>
       </w:r>
     </w:p>
     <w:p>

</xml_diff>

<commit_message>
Fix World Bank commodity price fetch — indicator API code never existed
_fetch_world_bank() called api.worldbank.org/v2/country/IDN/indicator/DPRICE.*,
but that indicator never existed in World Bank's catalog — commodity "Pink
Sheet" prices aren't served through the country-indicator REST API at all,
only as a monthly Excel workbook. Every call silently returned None.

Now downloads and parses the official CMO-Historical-Data-Monthly.xlsx
(cached 24h — it's only republished monthly) and reads the latest non-empty
value for the matching commodity column. Dropped the "kentang" (potato)
mapping since World Bank's Pink Sheet doesn't track potato prices at all —
it now falls straight through to the existing BPS hardcoded fallback instead
of hitting a fake endpoint every time. New dependency: openpyxl.
</commit_message>
<xml_diff>
--- a/docs/Dokumentasi_AgriTwin_v1.3.docx
+++ b/docs/Dokumentasi_AgriTwin_v1.3.docx
@@ -296,6 +296,14 @@
           <w:sz w:val="22"/>
         </w:rPr>
         <w:t>Modul &amp; Fitur</w:t>
+      </w:r>
+    </w:p>
+    <w:p>
+      <w:pPr>
+        <w:pStyle w:val="ListBullet"/>
+      </w:pPr>
+      <w:r>
+        <w:t>Fix: _fetch_world_bank() dulu selalu return None karena API indicator World Bank (DPRICE.*) yang dipakai tidak pernah ada di katalog resmi mereka - Pink Sheet (harga komoditas global) tidak dipublikasikan lewat REST indicator API, cuma lewat file Excel bulanan resmi (CMO-Historical-Data-Monthly.xlsx). Sekarang price_feed.py download dan parse file itu langsung (cache 24 jam, workbook cuma diupdate ~1x/bulan). Padi/jagung/kedelai/gula sekarang dapat harga real; kentang tetap fallback BPS karena World Bank memang tidak melacak harga kentang sama sekali. Dependency baru: openpyxl.</w:t>
       </w:r>
     </w:p>
     <w:p>

</xml_diff>